<commit_message>
Adición retrospectiva Entrega final
</commit_message>
<xml_diff>
--- a/Retrospectiva proyecto final.docx
+++ b/Retrospectiva proyecto final.docx
@@ -71,27 +71,7 @@
           <w:sz w:val="20"/>
           <w:szCs w:val="20"/>
         </w:rPr>
-        <w:t xml:space="preserve">¿Cuáles fueron los </w:t>
-      </w:r>
-      <w:proofErr w:type="spellStart"/>
-      <w:r>
-        <w:rPr>
-          <w:b/>
-          <w:bCs/>
-          <w:sz w:val="20"/>
-          <w:szCs w:val="20"/>
-        </w:rPr>
-        <w:t>mini-ciclos</w:t>
-      </w:r>
-      <w:proofErr w:type="spellEnd"/>
-      <w:r>
-        <w:rPr>
-          <w:b/>
-          <w:bCs/>
-          <w:sz w:val="20"/>
-          <w:szCs w:val="20"/>
-        </w:rPr>
-        <w:t xml:space="preserve"> definidos? Justifícalos.</w:t>
+        <w:t>¿Cuáles fueron los mini-ciclos definidos? Justifícalos.</w:t>
       </w:r>
     </w:p>
     <w:p>
@@ -222,23 +202,7 @@
           <w:sz w:val="20"/>
           <w:szCs w:val="20"/>
         </w:rPr>
-        <w:t xml:space="preserve">Se completaron los </w:t>
-      </w:r>
-      <w:proofErr w:type="spellStart"/>
-      <w:r>
-        <w:rPr>
-          <w:sz w:val="20"/>
-          <w:szCs w:val="20"/>
-        </w:rPr>
-        <w:t>miniciclos</w:t>
-      </w:r>
-      <w:proofErr w:type="spellEnd"/>
-      <w:r>
-        <w:rPr>
-          <w:sz w:val="20"/>
-          <w:szCs w:val="20"/>
-        </w:rPr>
-        <w:t xml:space="preserve"> definidos ya que hasta el momento no hay requerimientos</w:t>
+        <w:t>Se completaron los miniciclos definidos ya que hasta el momento no hay requerimientos</w:t>
       </w:r>
     </w:p>
     <w:p>
@@ -369,23 +333,7 @@
           <w:sz w:val="20"/>
           <w:szCs w:val="20"/>
         </w:rPr>
-        <w:t xml:space="preserve">El mayor logro fue definir con éxito la estructura visual para al momento de escribir el </w:t>
-      </w:r>
-      <w:proofErr w:type="spellStart"/>
-      <w:r>
-        <w:rPr>
-          <w:sz w:val="20"/>
-          <w:szCs w:val="20"/>
-        </w:rPr>
-        <w:t>codigo</w:t>
-      </w:r>
-      <w:proofErr w:type="spellEnd"/>
-      <w:r>
-        <w:rPr>
-          <w:sz w:val="20"/>
-          <w:szCs w:val="20"/>
-        </w:rPr>
-        <w:t xml:space="preserve"> podernos guiar con eso</w:t>
+        <w:t>El mayor logro fue definir con éxito la estructura visual para al momento de escribir el codigo podernos guiar con eso</w:t>
       </w:r>
     </w:p>
     <w:p>
@@ -449,39 +397,7 @@
           <w:sz w:val="20"/>
           <w:szCs w:val="20"/>
         </w:rPr>
-        <w:t xml:space="preserve">Como no </w:t>
-      </w:r>
-      <w:proofErr w:type="spellStart"/>
-      <w:r>
-        <w:rPr>
-          <w:sz w:val="20"/>
-          <w:szCs w:val="20"/>
-        </w:rPr>
-        <w:t>teniamos</w:t>
-      </w:r>
-      <w:proofErr w:type="spellEnd"/>
-      <w:r>
-        <w:rPr>
-          <w:sz w:val="20"/>
-          <w:szCs w:val="20"/>
-        </w:rPr>
-        <w:t xml:space="preserve"> requerimientos nos basamos en el juego y en que elementos </w:t>
-      </w:r>
-      <w:proofErr w:type="spellStart"/>
-      <w:r>
-        <w:rPr>
-          <w:sz w:val="20"/>
-          <w:szCs w:val="20"/>
-        </w:rPr>
-        <w:t>podiamos</w:t>
-      </w:r>
-      <w:proofErr w:type="spellEnd"/>
-      <w:r>
-        <w:rPr>
-          <w:sz w:val="20"/>
-          <w:szCs w:val="20"/>
-        </w:rPr>
-        <w:t xml:space="preserve"> poner como base para las extensiones </w:t>
+        <w:t xml:space="preserve">Como no teniamos requerimientos nos basamos en el juego y en que elementos podiamos poner como base para las extensiones </w:t>
       </w:r>
     </w:p>
     <w:p>
@@ -604,23 +520,7 @@
           <w:sz w:val="20"/>
           <w:szCs w:val="20"/>
         </w:rPr>
-        <w:t xml:space="preserve">dejar el juego listo para </w:t>
-      </w:r>
-      <w:proofErr w:type="spellStart"/>
-      <w:r>
-        <w:rPr>
-          <w:sz w:val="20"/>
-          <w:szCs w:val="20"/>
-        </w:rPr>
-        <w:t>extension</w:t>
-      </w:r>
-      <w:proofErr w:type="spellEnd"/>
-      <w:r>
-        <w:rPr>
-          <w:sz w:val="20"/>
-          <w:szCs w:val="20"/>
-        </w:rPr>
-        <w:t>, en diseño y en visual</w:t>
+        <w:t>dejar el juego listo para extension, en diseño y en visual</w:t>
       </w:r>
     </w:p>
     <w:p>
@@ -674,61 +574,7 @@
           <w:szCs w:val="20"/>
           <w:lang w:val="es-CO"/>
         </w:rPr>
-        <w:t xml:space="preserve">The </w:t>
-      </w:r>
-      <w:proofErr w:type="spellStart"/>
-      <w:r>
-        <w:rPr>
-          <w:sz w:val="20"/>
-          <w:szCs w:val="20"/>
-          <w:lang w:val="es-CO"/>
-        </w:rPr>
-        <w:t>worl</w:t>
-      </w:r>
-      <w:proofErr w:type="spellEnd"/>
-      <w:r>
-        <w:rPr>
-          <w:sz w:val="20"/>
-          <w:szCs w:val="20"/>
-          <w:lang w:val="es-CO"/>
-        </w:rPr>
-        <w:t xml:space="preserve"> </w:t>
-      </w:r>
-      <w:proofErr w:type="spellStart"/>
-      <w:r>
-        <w:rPr>
-          <w:sz w:val="20"/>
-          <w:szCs w:val="20"/>
-          <w:lang w:val="es-CO"/>
-        </w:rPr>
-        <w:t>hardest</w:t>
-      </w:r>
-      <w:proofErr w:type="spellEnd"/>
-      <w:r>
-        <w:rPr>
-          <w:sz w:val="20"/>
-          <w:szCs w:val="20"/>
-          <w:lang w:val="es-CO"/>
-        </w:rPr>
-        <w:t xml:space="preserve"> </w:t>
-      </w:r>
-      <w:proofErr w:type="spellStart"/>
-      <w:r>
-        <w:rPr>
-          <w:sz w:val="20"/>
-          <w:szCs w:val="20"/>
-          <w:lang w:val="es-CO"/>
-        </w:rPr>
-        <w:t>game</w:t>
-      </w:r>
-      <w:proofErr w:type="spellEnd"/>
-      <w:r>
-        <w:rPr>
-          <w:sz w:val="20"/>
-          <w:szCs w:val="20"/>
-          <w:lang w:val="es-CO"/>
-        </w:rPr>
-        <w:t>, revisamos los mapas, funcionamie</w:t>
+        <w:t>The worl hardest game, revisamos los mapas, funcionamie</w:t>
       </w:r>
       <w:r>
         <w:rPr>
@@ -1078,27 +924,7 @@
           <w:sz w:val="20"/>
           <w:szCs w:val="20"/>
         </w:rPr>
-        <w:t xml:space="preserve">2. ¿Cuál es el estado actual del proyecto en términos de </w:t>
-      </w:r>
-      <w:proofErr w:type="spellStart"/>
-      <w:r>
-        <w:rPr>
-          <w:b/>
-          <w:bCs/>
-          <w:sz w:val="20"/>
-          <w:szCs w:val="20"/>
-        </w:rPr>
-        <w:t>mini-ciclos</w:t>
-      </w:r>
-      <w:proofErr w:type="spellEnd"/>
-      <w:r>
-        <w:rPr>
-          <w:b/>
-          <w:bCs/>
-          <w:sz w:val="20"/>
-          <w:szCs w:val="20"/>
-        </w:rPr>
-        <w:t>? ¿por qué?</w:t>
+        <w:t>2. ¿Cuál es el estado actual del proyecto en términos de mini-ciclos? ¿por qué?</w:t>
       </w:r>
     </w:p>
     <w:p>
@@ -1442,23 +1268,7 @@
           <w:sz w:val="20"/>
           <w:szCs w:val="20"/>
         </w:rPr>
-        <w:t xml:space="preserve">La definición del diseño para que el </w:t>
-      </w:r>
-      <w:proofErr w:type="spellStart"/>
-      <w:r>
-        <w:rPr>
-          <w:sz w:val="20"/>
-          <w:szCs w:val="20"/>
-        </w:rPr>
-        <w:t>codigo</w:t>
-      </w:r>
-      <w:proofErr w:type="spellEnd"/>
-      <w:r>
-        <w:rPr>
-          <w:sz w:val="20"/>
-          <w:szCs w:val="20"/>
-        </w:rPr>
-        <w:t xml:space="preserve"> quedara bien estructurado</w:t>
+        <w:t>La definición del diseño para que el codigo quedara bien estructurado</w:t>
       </w:r>
     </w:p>
     <w:p>
@@ -1602,87 +1412,14 @@
           <w:sz w:val="20"/>
           <w:szCs w:val="20"/>
         </w:rPr>
-        <w:t xml:space="preserve">el juego </w:t>
-      </w:r>
-      <w:proofErr w:type="spellStart"/>
-      <w:r>
-        <w:rPr>
-          <w:sz w:val="20"/>
-          <w:szCs w:val="20"/>
-        </w:rPr>
-        <w:t>the</w:t>
-      </w:r>
-      <w:proofErr w:type="spellEnd"/>
-      <w:r>
-        <w:rPr>
-          <w:sz w:val="20"/>
-          <w:szCs w:val="20"/>
-        </w:rPr>
-        <w:t xml:space="preserve"> </w:t>
-      </w:r>
-      <w:proofErr w:type="spellStart"/>
-      <w:r>
-        <w:rPr>
-          <w:sz w:val="20"/>
-          <w:szCs w:val="20"/>
-        </w:rPr>
-        <w:t>world</w:t>
-      </w:r>
-      <w:proofErr w:type="spellEnd"/>
-      <w:r>
-        <w:rPr>
-          <w:sz w:val="20"/>
-          <w:szCs w:val="20"/>
-        </w:rPr>
-        <w:t xml:space="preserve"> </w:t>
-      </w:r>
-      <w:proofErr w:type="spellStart"/>
-      <w:r>
-        <w:rPr>
-          <w:sz w:val="20"/>
-          <w:szCs w:val="20"/>
-        </w:rPr>
-        <w:t>hardest</w:t>
-      </w:r>
-      <w:proofErr w:type="spellEnd"/>
-      <w:r>
-        <w:rPr>
-          <w:sz w:val="20"/>
-          <w:szCs w:val="20"/>
-        </w:rPr>
-        <w:t xml:space="preserve"> </w:t>
-      </w:r>
-      <w:proofErr w:type="spellStart"/>
-      <w:proofErr w:type="gramStart"/>
-      <w:r>
-        <w:rPr>
-          <w:sz w:val="20"/>
-          <w:szCs w:val="20"/>
-        </w:rPr>
-        <w:t>game</w:t>
-      </w:r>
-      <w:proofErr w:type="spellEnd"/>
-      <w:r>
-        <w:rPr>
-          <w:sz w:val="20"/>
-          <w:szCs w:val="20"/>
-        </w:rPr>
-        <w:t xml:space="preserve"> </w:t>
-      </w:r>
-      <w:r>
-        <w:rPr>
-          <w:sz w:val="20"/>
-          <w:szCs w:val="20"/>
-        </w:rPr>
-        <w:t xml:space="preserve"> y</w:t>
-      </w:r>
-      <w:proofErr w:type="gramEnd"/>
-      <w:r>
-        <w:rPr>
-          <w:sz w:val="20"/>
-          <w:szCs w:val="20"/>
-        </w:rPr>
-        <w:t xml:space="preserve"> el api de java</w:t>
+        <w:t xml:space="preserve">el juego the world hardest game </w:t>
+      </w:r>
+      <w:r>
+        <w:rPr>
+          <w:sz w:val="20"/>
+          <w:szCs w:val="20"/>
+        </w:rPr>
+        <w:t xml:space="preserve"> y el api de java</w:t>
       </w:r>
     </w:p>
     <w:p>
@@ -1883,7 +1620,6 @@
         </w:rPr>
         <w:t xml:space="preserve">de </w:t>
       </w:r>
-      <w:proofErr w:type="spellStart"/>
       <w:r>
         <w:rPr>
           <w:sz w:val="20"/>
@@ -1891,7 +1627,6 @@
         </w:rPr>
         <w:t>codigo</w:t>
       </w:r>
-      <w:proofErr w:type="spellEnd"/>
     </w:p>
     <w:p>
       <w:pPr>
@@ -2223,23 +1958,7 @@
           <w:sz w:val="20"/>
           <w:szCs w:val="20"/>
         </w:rPr>
-        <w:t xml:space="preserve">en el </w:t>
-      </w:r>
-      <w:proofErr w:type="spellStart"/>
-      <w:r>
-        <w:rPr>
-          <w:sz w:val="20"/>
-          <w:szCs w:val="20"/>
-        </w:rPr>
-        <w:t>codigo</w:t>
-      </w:r>
-      <w:proofErr w:type="spellEnd"/>
-      <w:r>
-        <w:rPr>
-          <w:sz w:val="20"/>
-          <w:szCs w:val="20"/>
-        </w:rPr>
-        <w:t>, ya el juego se puede jugar</w:t>
+        <w:t>en el codigo, ya el juego se puede jugar</w:t>
       </w:r>
     </w:p>
     <w:p>
@@ -2520,69 +2239,12 @@
         </w:rPr>
         <w:t xml:space="preserve">revisamos </w:t>
       </w:r>
-      <w:proofErr w:type="spellStart"/>
-      <w:r>
-        <w:rPr>
-          <w:sz w:val="20"/>
-          <w:szCs w:val="20"/>
-        </w:rPr>
-        <w:t>the</w:t>
-      </w:r>
-      <w:proofErr w:type="spellEnd"/>
-      <w:r>
-        <w:rPr>
-          <w:sz w:val="20"/>
-          <w:szCs w:val="20"/>
-        </w:rPr>
-        <w:t xml:space="preserve"> </w:t>
-      </w:r>
-      <w:proofErr w:type="spellStart"/>
-      <w:r>
-        <w:rPr>
-          <w:sz w:val="20"/>
-          <w:szCs w:val="20"/>
-        </w:rPr>
-        <w:t>world</w:t>
-      </w:r>
-      <w:proofErr w:type="spellEnd"/>
-      <w:r>
-        <w:rPr>
-          <w:sz w:val="20"/>
-          <w:szCs w:val="20"/>
-        </w:rPr>
-        <w:t xml:space="preserve"> </w:t>
-      </w:r>
-      <w:proofErr w:type="spellStart"/>
-      <w:r>
-        <w:rPr>
-          <w:sz w:val="20"/>
-          <w:szCs w:val="20"/>
-        </w:rPr>
-        <w:t>hardest</w:t>
-      </w:r>
-      <w:proofErr w:type="spellEnd"/>
-      <w:r>
-        <w:rPr>
-          <w:sz w:val="20"/>
-          <w:szCs w:val="20"/>
-        </w:rPr>
-        <w:t xml:space="preserve"> </w:t>
-      </w:r>
-      <w:proofErr w:type="spellStart"/>
-      <w:r>
-        <w:rPr>
-          <w:sz w:val="20"/>
-          <w:szCs w:val="20"/>
-        </w:rPr>
-        <w:t>game</w:t>
-      </w:r>
-      <w:proofErr w:type="spellEnd"/>
-      <w:r>
-        <w:rPr>
-          <w:sz w:val="20"/>
-          <w:szCs w:val="20"/>
-        </w:rPr>
-        <w:t xml:space="preserve"> </w:t>
+      <w:r>
+        <w:rPr>
+          <w:sz w:val="20"/>
+          <w:szCs w:val="20"/>
+        </w:rPr>
+        <w:t xml:space="preserve">the world hardest game </w:t>
       </w:r>
       <w:r>
         <w:rPr>
@@ -2726,27 +2388,7 @@
           <w:sz w:val="20"/>
           <w:szCs w:val="20"/>
         </w:rPr>
-        <w:t xml:space="preserve">1. ¿Cuáles fueron los </w:t>
-      </w:r>
-      <w:proofErr w:type="spellStart"/>
-      <w:r>
-        <w:rPr>
-          <w:b/>
-          <w:bCs/>
-          <w:sz w:val="20"/>
-          <w:szCs w:val="20"/>
-        </w:rPr>
-        <w:t>mini-ciclos</w:t>
-      </w:r>
-      <w:proofErr w:type="spellEnd"/>
-      <w:r>
-        <w:rPr>
-          <w:b/>
-          <w:bCs/>
-          <w:sz w:val="20"/>
-          <w:szCs w:val="20"/>
-        </w:rPr>
-        <w:t xml:space="preserve"> definidos? Justifícalos.</w:t>
+        <w:t>1. ¿Cuáles fueron los mini-ciclos definidos? Justifícalos.</w:t>
       </w:r>
     </w:p>
     <w:p>
@@ -2847,17 +2489,8 @@
           <w:sz w:val="20"/>
           <w:szCs w:val="20"/>
         </w:rPr>
-        <w:t xml:space="preserve">Adición </w:t>
-      </w:r>
-      <w:proofErr w:type="spellStart"/>
-      <w:r>
-        <w:rPr>
-          <w:sz w:val="20"/>
-          <w:szCs w:val="20"/>
-        </w:rPr>
-        <w:t>coverage</w:t>
-      </w:r>
-      <w:proofErr w:type="spellEnd"/>
+        <w:t>Adición coverage</w:t>
+      </w:r>
     </w:p>
     <w:p>
       <w:pPr>
@@ -2912,27 +2545,7 @@
           <w:sz w:val="20"/>
           <w:szCs w:val="20"/>
         </w:rPr>
-        <w:t xml:space="preserve">2. ¿Cuál es el estado actual del proyecto en términos de </w:t>
-      </w:r>
-      <w:proofErr w:type="spellStart"/>
-      <w:r>
-        <w:rPr>
-          <w:b/>
-          <w:bCs/>
-          <w:sz w:val="20"/>
-          <w:szCs w:val="20"/>
-        </w:rPr>
-        <w:t>mini-ciclos</w:t>
-      </w:r>
-      <w:proofErr w:type="spellEnd"/>
-      <w:r>
-        <w:rPr>
-          <w:b/>
-          <w:bCs/>
-          <w:sz w:val="20"/>
-          <w:szCs w:val="20"/>
-        </w:rPr>
-        <w:t>? ¿por qué?</w:t>
+        <w:t>2. ¿Cuál es el estado actual del proyecto en términos de mini-ciclos? ¿por qué?</w:t>
       </w:r>
     </w:p>
     <w:p>
@@ -2962,23 +2575,7 @@
           <w:sz w:val="20"/>
           <w:szCs w:val="20"/>
         </w:rPr>
-        <w:t xml:space="preserve">y hemos avanzado en todos los </w:t>
-      </w:r>
-      <w:proofErr w:type="spellStart"/>
-      <w:r>
-        <w:rPr>
-          <w:sz w:val="20"/>
-          <w:szCs w:val="20"/>
-        </w:rPr>
-        <w:t>miniciclos</w:t>
-      </w:r>
-      <w:proofErr w:type="spellEnd"/>
-      <w:r>
-        <w:rPr>
-          <w:sz w:val="20"/>
-          <w:szCs w:val="20"/>
-        </w:rPr>
-        <w:t xml:space="preserve"> </w:t>
+        <w:t xml:space="preserve">y hemos avanzado en todos los miniciclos </w:t>
       </w:r>
       <w:r>
         <w:rPr>
@@ -3230,55 +2827,7 @@
           <w:sz w:val="20"/>
           <w:szCs w:val="20"/>
         </w:rPr>
-        <w:t xml:space="preserve">la </w:t>
-      </w:r>
-      <w:proofErr w:type="spellStart"/>
-      <w:r>
-        <w:rPr>
-          <w:sz w:val="20"/>
-          <w:szCs w:val="20"/>
-        </w:rPr>
-        <w:t>creacion</w:t>
-      </w:r>
-      <w:proofErr w:type="spellEnd"/>
-      <w:r>
-        <w:rPr>
-          <w:sz w:val="20"/>
-          <w:szCs w:val="20"/>
-        </w:rPr>
-        <w:t xml:space="preserve"> </w:t>
-      </w:r>
-      <w:proofErr w:type="gramStart"/>
-      <w:r>
-        <w:rPr>
-          <w:sz w:val="20"/>
-          <w:szCs w:val="20"/>
-        </w:rPr>
-        <w:t>de test</w:t>
-      </w:r>
-      <w:proofErr w:type="gramEnd"/>
-      <w:r>
-        <w:rPr>
-          <w:sz w:val="20"/>
-          <w:szCs w:val="20"/>
-        </w:rPr>
-        <w:t xml:space="preserve"> para cumplir con el 75 de </w:t>
-      </w:r>
-      <w:proofErr w:type="spellStart"/>
-      <w:r>
-        <w:rPr>
-          <w:sz w:val="20"/>
-          <w:szCs w:val="20"/>
-        </w:rPr>
-        <w:t>coverage</w:t>
-      </w:r>
-      <w:proofErr w:type="spellEnd"/>
-      <w:r>
-        <w:rPr>
-          <w:sz w:val="20"/>
-          <w:szCs w:val="20"/>
-        </w:rPr>
-        <w:t>, al momento tenemos 50</w:t>
+        <w:t>la creacion de test para cumplir con el 75 de coverage, al momento tenemos 50</w:t>
       </w:r>
     </w:p>
     <w:p>
@@ -3349,23 +2898,7 @@
           <w:sz w:val="20"/>
           <w:szCs w:val="20"/>
         </w:rPr>
-        <w:t xml:space="preserve">agregamos algunos </w:t>
-      </w:r>
-      <w:proofErr w:type="spellStart"/>
-      <w:r>
-        <w:rPr>
-          <w:sz w:val="20"/>
-          <w:szCs w:val="20"/>
-        </w:rPr>
-        <w:t>entrgables</w:t>
-      </w:r>
-      <w:proofErr w:type="spellEnd"/>
-      <w:r>
-        <w:rPr>
-          <w:sz w:val="20"/>
-          <w:szCs w:val="20"/>
-        </w:rPr>
-        <w:t xml:space="preserve"> faltantes y se avanzó bastante</w:t>
+        <w:t>agregamos algunos entrgables faltantes y se avanzó bastante</w:t>
       </w:r>
     </w:p>
     <w:p>
@@ -3422,23 +2955,7 @@
           <w:sz w:val="20"/>
           <w:szCs w:val="20"/>
         </w:rPr>
-        <w:t xml:space="preserve">s pruebas de </w:t>
-      </w:r>
-      <w:proofErr w:type="spellStart"/>
-      <w:r>
-        <w:rPr>
-          <w:sz w:val="20"/>
-          <w:szCs w:val="20"/>
-        </w:rPr>
-        <w:t>regresion</w:t>
-      </w:r>
-      <w:proofErr w:type="spellEnd"/>
-      <w:r>
-        <w:rPr>
-          <w:sz w:val="20"/>
-          <w:szCs w:val="20"/>
-        </w:rPr>
-        <w:t xml:space="preserve">, con esto logramos verificar el funcionamiento correcto </w:t>
+        <w:t xml:space="preserve">s pruebas de regresion, con esto logramos verificar el funcionamiento correcto </w:t>
       </w:r>
       <w:r>
         <w:rPr>
@@ -3452,17 +2969,8 @@
           <w:sz w:val="20"/>
           <w:szCs w:val="20"/>
         </w:rPr>
-        <w:t xml:space="preserve"> </w:t>
-      </w:r>
-      <w:proofErr w:type="spellStart"/>
-      <w:r>
-        <w:rPr>
-          <w:sz w:val="20"/>
-          <w:szCs w:val="20"/>
-        </w:rPr>
-        <w:t>codigo</w:t>
-      </w:r>
-      <w:proofErr w:type="spellEnd"/>
+        <w:t xml:space="preserve"> codigo</w:t>
+      </w:r>
     </w:p>
     <w:p>
       <w:pPr>
@@ -3515,69 +3023,12 @@
         </w:rPr>
         <w:t xml:space="preserve">revisamos </w:t>
       </w:r>
-      <w:proofErr w:type="spellStart"/>
-      <w:r>
-        <w:rPr>
-          <w:sz w:val="20"/>
-          <w:szCs w:val="20"/>
-        </w:rPr>
-        <w:t>teh</w:t>
-      </w:r>
-      <w:proofErr w:type="spellEnd"/>
-      <w:r>
-        <w:rPr>
-          <w:sz w:val="20"/>
-          <w:szCs w:val="20"/>
-        </w:rPr>
-        <w:t xml:space="preserve"> </w:t>
-      </w:r>
-      <w:proofErr w:type="spellStart"/>
-      <w:r>
-        <w:rPr>
-          <w:sz w:val="20"/>
-          <w:szCs w:val="20"/>
-        </w:rPr>
-        <w:t>world</w:t>
-      </w:r>
-      <w:proofErr w:type="spellEnd"/>
-      <w:r>
-        <w:rPr>
-          <w:sz w:val="20"/>
-          <w:szCs w:val="20"/>
-        </w:rPr>
-        <w:t xml:space="preserve"> </w:t>
-      </w:r>
-      <w:proofErr w:type="spellStart"/>
-      <w:r>
-        <w:rPr>
-          <w:sz w:val="20"/>
-          <w:szCs w:val="20"/>
-        </w:rPr>
-        <w:t>hardest</w:t>
-      </w:r>
-      <w:proofErr w:type="spellEnd"/>
-      <w:r>
-        <w:rPr>
-          <w:sz w:val="20"/>
-          <w:szCs w:val="20"/>
-        </w:rPr>
-        <w:t xml:space="preserve"> </w:t>
-      </w:r>
-      <w:proofErr w:type="spellStart"/>
-      <w:r>
-        <w:rPr>
-          <w:sz w:val="20"/>
-          <w:szCs w:val="20"/>
-        </w:rPr>
-        <w:t>game</w:t>
-      </w:r>
-      <w:proofErr w:type="spellEnd"/>
-      <w:r>
-        <w:rPr>
-          <w:sz w:val="20"/>
-          <w:szCs w:val="20"/>
-        </w:rPr>
-        <w:t xml:space="preserve">, </w:t>
+      <w:r>
+        <w:rPr>
+          <w:sz w:val="20"/>
+          <w:szCs w:val="20"/>
+        </w:rPr>
+        <w:t xml:space="preserve">teh world hardest game, </w:t>
       </w:r>
       <w:r>
         <w:rPr>
@@ -3591,99 +3042,82 @@
           <w:sz w:val="20"/>
           <w:szCs w:val="20"/>
         </w:rPr>
-        <w:t xml:space="preserve"> y </w:t>
-      </w:r>
-      <w:proofErr w:type="spellStart"/>
-      <w:r>
-        <w:rPr>
-          <w:sz w:val="20"/>
-          <w:szCs w:val="20"/>
-        </w:rPr>
-        <w:t>marketplace</w:t>
-      </w:r>
-      <w:proofErr w:type="spellEnd"/>
-      <w:r>
-        <w:rPr>
-          <w:sz w:val="20"/>
-          <w:szCs w:val="20"/>
-        </w:rPr>
-        <w:t xml:space="preserve"> de eclipse </w:t>
-      </w:r>
-    </w:p>
-    <w:p>
-      <w:pPr>
-        <w:rPr>
-          <w:sz w:val="20"/>
-          <w:szCs w:val="20"/>
-        </w:rPr>
-      </w:pPr>
-    </w:p>
-    <w:p>
-      <w:pPr>
-        <w:rPr>
-          <w:sz w:val="20"/>
-          <w:szCs w:val="20"/>
-        </w:rPr>
-      </w:pPr>
-    </w:p>
-    <w:p>
-      <w:pPr>
-        <w:rPr>
-          <w:sz w:val="20"/>
-          <w:szCs w:val="20"/>
-        </w:rPr>
-      </w:pPr>
-    </w:p>
-    <w:p>
-      <w:pPr>
-        <w:rPr>
-          <w:sz w:val="20"/>
-          <w:szCs w:val="20"/>
-        </w:rPr>
-      </w:pPr>
-    </w:p>
-    <w:p>
-      <w:pPr>
-        <w:rPr>
-          <w:sz w:val="20"/>
-          <w:szCs w:val="20"/>
-        </w:rPr>
-      </w:pPr>
-    </w:p>
-    <w:p>
-      <w:pPr>
-        <w:rPr>
-          <w:sz w:val="20"/>
-          <w:szCs w:val="20"/>
-        </w:rPr>
-      </w:pPr>
-    </w:p>
-    <w:p>
-      <w:pPr>
-        <w:rPr>
-          <w:sz w:val="20"/>
-          <w:szCs w:val="20"/>
-        </w:rPr>
-      </w:pPr>
-    </w:p>
-    <w:p>
-      <w:pPr>
-        <w:rPr>
-          <w:sz w:val="20"/>
-          <w:szCs w:val="20"/>
-        </w:rPr>
-      </w:pPr>
-    </w:p>
-    <w:p>
-      <w:pPr>
-        <w:rPr>
-          <w:b/>
-          <w:bCs/>
-          <w:sz w:val="20"/>
-          <w:szCs w:val="20"/>
-        </w:rPr>
-      </w:pPr>
-      <w:proofErr w:type="gramStart"/>
+        <w:t xml:space="preserve"> y marketplace de eclipse </w:t>
+      </w:r>
+    </w:p>
+    <w:p>
+      <w:pPr>
+        <w:rPr>
+          <w:sz w:val="20"/>
+          <w:szCs w:val="20"/>
+        </w:rPr>
+      </w:pPr>
+    </w:p>
+    <w:p>
+      <w:pPr>
+        <w:rPr>
+          <w:sz w:val="20"/>
+          <w:szCs w:val="20"/>
+        </w:rPr>
+      </w:pPr>
+    </w:p>
+    <w:p>
+      <w:pPr>
+        <w:rPr>
+          <w:sz w:val="20"/>
+          <w:szCs w:val="20"/>
+        </w:rPr>
+      </w:pPr>
+    </w:p>
+    <w:p>
+      <w:pPr>
+        <w:rPr>
+          <w:sz w:val="20"/>
+          <w:szCs w:val="20"/>
+        </w:rPr>
+      </w:pPr>
+    </w:p>
+    <w:p>
+      <w:pPr>
+        <w:rPr>
+          <w:sz w:val="20"/>
+          <w:szCs w:val="20"/>
+        </w:rPr>
+      </w:pPr>
+    </w:p>
+    <w:p>
+      <w:pPr>
+        <w:rPr>
+          <w:sz w:val="20"/>
+          <w:szCs w:val="20"/>
+        </w:rPr>
+      </w:pPr>
+    </w:p>
+    <w:p>
+      <w:pPr>
+        <w:rPr>
+          <w:sz w:val="20"/>
+          <w:szCs w:val="20"/>
+        </w:rPr>
+      </w:pPr>
+    </w:p>
+    <w:p>
+      <w:pPr>
+        <w:rPr>
+          <w:sz w:val="20"/>
+          <w:szCs w:val="20"/>
+        </w:rPr>
+      </w:pPr>
+    </w:p>
+    <w:p>
+      <w:pPr>
+        <w:rPr>
+          <w:b/>
+          <w:bCs/>
+          <w:sz w:val="20"/>
+          <w:szCs w:val="20"/>
+        </w:rPr>
+      </w:pPr>
       <w:r>
         <w:rPr>
           <w:b/>
@@ -3712,7 +3146,6 @@
         </w:rPr>
         <w:t>entrega</w:t>
       </w:r>
-      <w:proofErr w:type="gramEnd"/>
       <w:r>
         <w:rPr>
           <w:b/>
@@ -3749,27 +3182,7 @@
           <w:sz w:val="20"/>
           <w:szCs w:val="20"/>
         </w:rPr>
-        <w:t xml:space="preserve">1. ¿Cuáles fueron los </w:t>
-      </w:r>
-      <w:proofErr w:type="spellStart"/>
-      <w:r>
-        <w:rPr>
-          <w:b/>
-          <w:bCs/>
-          <w:sz w:val="20"/>
-          <w:szCs w:val="20"/>
-        </w:rPr>
-        <w:t>mini-ciclos</w:t>
-      </w:r>
-      <w:proofErr w:type="spellEnd"/>
-      <w:r>
-        <w:rPr>
-          <w:b/>
-          <w:bCs/>
-          <w:sz w:val="20"/>
-          <w:szCs w:val="20"/>
-        </w:rPr>
-        <w:t xml:space="preserve"> definidos? Justifícalos.</w:t>
+        <w:t>1. ¿Cuáles fueron los mini-ciclos definidos? Justifícalos.</w:t>
       </w:r>
     </w:p>
     <w:p>
@@ -3825,14 +3238,7 @@
           <w:sz w:val="20"/>
           <w:szCs w:val="20"/>
         </w:rPr>
-        <w:t>Corrección</w:t>
-      </w:r>
-      <w:r>
-        <w:rPr>
-          <w:sz w:val="20"/>
-          <w:szCs w:val="20"/>
-        </w:rPr>
-        <w:t xml:space="preserve"> de pruebas </w:t>
+        <w:t xml:space="preserve">Corrección de pruebas </w:t>
       </w:r>
     </w:p>
     <w:p>
@@ -3851,14 +3257,7 @@
           <w:sz w:val="20"/>
           <w:szCs w:val="20"/>
         </w:rPr>
-        <w:t>Corrección</w:t>
-      </w:r>
-      <w:r>
-        <w:rPr>
-          <w:sz w:val="20"/>
-          <w:szCs w:val="20"/>
-        </w:rPr>
-        <w:t xml:space="preserve"> de PMD</w:t>
+        <w:t>Corrección de PMD</w:t>
       </w:r>
     </w:p>
     <w:p>
@@ -3877,17 +3276,8 @@
           <w:sz w:val="20"/>
           <w:szCs w:val="20"/>
         </w:rPr>
-        <w:t xml:space="preserve">Revisión de </w:t>
-      </w:r>
-      <w:proofErr w:type="spellStart"/>
-      <w:r>
-        <w:rPr>
-          <w:sz w:val="20"/>
-          <w:szCs w:val="20"/>
-        </w:rPr>
-        <w:t>coverage</w:t>
-      </w:r>
-      <w:proofErr w:type="spellEnd"/>
+        <w:t>Revisión de coverage</w:t>
+      </w:r>
     </w:p>
     <w:p>
       <w:pPr>
@@ -3962,17 +3352,8 @@
           <w:sz w:val="20"/>
           <w:szCs w:val="20"/>
         </w:rPr>
-        <w:t xml:space="preserve">Adición </w:t>
-      </w:r>
-      <w:proofErr w:type="spellStart"/>
-      <w:r>
-        <w:rPr>
-          <w:sz w:val="20"/>
-          <w:szCs w:val="20"/>
-        </w:rPr>
-        <w:t>Github</w:t>
-      </w:r>
-      <w:proofErr w:type="spellEnd"/>
+        <w:t>Adición Github</w:t>
+      </w:r>
     </w:p>
     <w:p>
       <w:pPr>
@@ -4015,66 +3396,30 @@
           <w:sz w:val="20"/>
           <w:szCs w:val="20"/>
         </w:rPr>
-        <w:t xml:space="preserve">2. ¿Cuál es el estado actual del proyecto en términos de </w:t>
-      </w:r>
-      <w:proofErr w:type="spellStart"/>
-      <w:r>
-        <w:rPr>
-          <w:b/>
-          <w:bCs/>
-          <w:sz w:val="20"/>
-          <w:szCs w:val="20"/>
-        </w:rPr>
-        <w:t>mini-ciclos</w:t>
-      </w:r>
-      <w:proofErr w:type="spellEnd"/>
-      <w:r>
-        <w:rPr>
-          <w:b/>
-          <w:bCs/>
-          <w:sz w:val="20"/>
-          <w:szCs w:val="20"/>
-        </w:rPr>
-        <w:t>? ¿por qué?</w:t>
-      </w:r>
-    </w:p>
-    <w:p>
-      <w:pPr>
-        <w:rPr>
-          <w:sz w:val="20"/>
-          <w:szCs w:val="20"/>
-        </w:rPr>
-      </w:pPr>
-    </w:p>
-    <w:p>
-      <w:pPr>
-        <w:rPr>
-          <w:sz w:val="20"/>
-          <w:szCs w:val="20"/>
-        </w:rPr>
-      </w:pPr>
-      <w:r>
-        <w:rPr>
-          <w:sz w:val="20"/>
-          <w:szCs w:val="20"/>
-        </w:rPr>
-        <w:t xml:space="preserve">Hicimos las correcciones correspondientes y hemos avanzado en todos los </w:t>
-      </w:r>
-      <w:proofErr w:type="spellStart"/>
-      <w:r>
-        <w:rPr>
-          <w:sz w:val="20"/>
-          <w:szCs w:val="20"/>
-        </w:rPr>
-        <w:t>miniciclos</w:t>
-      </w:r>
-      <w:proofErr w:type="spellEnd"/>
-      <w:r>
-        <w:rPr>
-          <w:sz w:val="20"/>
-          <w:szCs w:val="20"/>
-        </w:rPr>
-        <w:t xml:space="preserve">  </w:t>
+        <w:t>2. ¿Cuál es el estado actual del proyecto en términos de mini-ciclos? ¿por qué?</w:t>
+      </w:r>
+    </w:p>
+    <w:p>
+      <w:pPr>
+        <w:rPr>
+          <w:sz w:val="20"/>
+          <w:szCs w:val="20"/>
+        </w:rPr>
+      </w:pPr>
+    </w:p>
+    <w:p>
+      <w:pPr>
+        <w:rPr>
+          <w:sz w:val="20"/>
+          <w:szCs w:val="20"/>
+        </w:rPr>
+      </w:pPr>
+      <w:r>
+        <w:rPr>
+          <w:sz w:val="20"/>
+          <w:szCs w:val="20"/>
+        </w:rPr>
+        <w:t xml:space="preserve">Hicimos las correcciones correspondientes y hemos avanzado en todos los miniciclos  </w:t>
       </w:r>
     </w:p>
     <w:p>
@@ -4312,62 +3657,14 @@
           <w:sz w:val="20"/>
           <w:szCs w:val="20"/>
         </w:rPr>
-        <w:t xml:space="preserve"> </w:t>
-      </w:r>
-      <w:proofErr w:type="gramStart"/>
-      <w:r>
-        <w:rPr>
-          <w:sz w:val="20"/>
-          <w:szCs w:val="20"/>
-        </w:rPr>
-        <w:t>de test</w:t>
-      </w:r>
-      <w:proofErr w:type="gramEnd"/>
-      <w:r>
-        <w:rPr>
-          <w:sz w:val="20"/>
-          <w:szCs w:val="20"/>
-        </w:rPr>
-        <w:t xml:space="preserve"> para cumplir con el 75 de </w:t>
-      </w:r>
-      <w:proofErr w:type="spellStart"/>
-      <w:r>
-        <w:rPr>
-          <w:sz w:val="20"/>
-          <w:szCs w:val="20"/>
-        </w:rPr>
-        <w:t>coverage</w:t>
-      </w:r>
-      <w:proofErr w:type="spellEnd"/>
-      <w:r>
-        <w:rPr>
-          <w:sz w:val="20"/>
-          <w:szCs w:val="20"/>
-        </w:rPr>
-        <w:t>, al momento tenemos 50</w:t>
-      </w:r>
-      <w:r>
-        <w:rPr>
-          <w:sz w:val="20"/>
-          <w:szCs w:val="20"/>
-        </w:rPr>
-        <w:t xml:space="preserve"> y reducir la cantidad de </w:t>
-      </w:r>
-      <w:proofErr w:type="spellStart"/>
-      <w:r>
-        <w:rPr>
-          <w:sz w:val="20"/>
-          <w:szCs w:val="20"/>
-        </w:rPr>
-        <w:t>flags</w:t>
-      </w:r>
-      <w:proofErr w:type="spellEnd"/>
-      <w:r>
-        <w:rPr>
-          <w:sz w:val="20"/>
-          <w:szCs w:val="20"/>
-        </w:rPr>
-        <w:t xml:space="preserve"> marcadas en el PMD</w:t>
+        <w:t xml:space="preserve"> de test para cumplir con el 75 de coverage, al momento tenemos 50</w:t>
+      </w:r>
+      <w:r>
+        <w:rPr>
+          <w:sz w:val="20"/>
+          <w:szCs w:val="20"/>
+        </w:rPr>
+        <w:t xml:space="preserve"> y reducir la cantidad de flags marcadas en el PMD</w:t>
       </w:r>
     </w:p>
     <w:p>
@@ -4570,102 +3867,59 @@
         </w:rPr>
         <w:t xml:space="preserve">revisamos </w:t>
       </w:r>
-      <w:proofErr w:type="spellStart"/>
-      <w:r>
-        <w:rPr>
-          <w:sz w:val="20"/>
-          <w:szCs w:val="20"/>
-        </w:rPr>
-        <w:t>teh</w:t>
-      </w:r>
-      <w:proofErr w:type="spellEnd"/>
-      <w:r>
-        <w:rPr>
-          <w:sz w:val="20"/>
-          <w:szCs w:val="20"/>
-        </w:rPr>
-        <w:t xml:space="preserve"> </w:t>
-      </w:r>
-      <w:proofErr w:type="spellStart"/>
-      <w:r>
-        <w:rPr>
-          <w:sz w:val="20"/>
-          <w:szCs w:val="20"/>
-        </w:rPr>
-        <w:t>world</w:t>
-      </w:r>
-      <w:proofErr w:type="spellEnd"/>
-      <w:r>
-        <w:rPr>
-          <w:sz w:val="20"/>
-          <w:szCs w:val="20"/>
-        </w:rPr>
-        <w:t xml:space="preserve"> </w:t>
-      </w:r>
-      <w:proofErr w:type="spellStart"/>
-      <w:r>
-        <w:rPr>
-          <w:sz w:val="20"/>
-          <w:szCs w:val="20"/>
-        </w:rPr>
-        <w:t>hardest</w:t>
-      </w:r>
-      <w:proofErr w:type="spellEnd"/>
-      <w:r>
-        <w:rPr>
-          <w:sz w:val="20"/>
-          <w:szCs w:val="20"/>
-        </w:rPr>
-        <w:t xml:space="preserve"> </w:t>
-      </w:r>
-      <w:proofErr w:type="spellStart"/>
-      <w:r>
-        <w:rPr>
-          <w:sz w:val="20"/>
-          <w:szCs w:val="20"/>
-        </w:rPr>
-        <w:t>game</w:t>
-      </w:r>
-      <w:proofErr w:type="spellEnd"/>
-      <w:r>
-        <w:rPr>
-          <w:sz w:val="20"/>
-          <w:szCs w:val="20"/>
-        </w:rPr>
-        <w:t xml:space="preserve">, el api de java y </w:t>
-      </w:r>
-      <w:proofErr w:type="spellStart"/>
-      <w:r>
-        <w:rPr>
-          <w:sz w:val="20"/>
-          <w:szCs w:val="20"/>
-        </w:rPr>
-        <w:t>marketplace</w:t>
-      </w:r>
-      <w:proofErr w:type="spellEnd"/>
-      <w:r>
-        <w:rPr>
-          <w:sz w:val="20"/>
-          <w:szCs w:val="20"/>
-        </w:rPr>
-        <w:t xml:space="preserve"> de eclipse</w:t>
-      </w:r>
-    </w:p>
-    <w:p>
-      <w:pPr>
-        <w:rPr>
-          <w:sz w:val="20"/>
-          <w:szCs w:val="20"/>
-        </w:rPr>
-      </w:pPr>
-    </w:p>
-    <w:p>
-      <w:pPr>
-        <w:rPr>
-          <w:sz w:val="20"/>
-          <w:szCs w:val="20"/>
-        </w:rPr>
-      </w:pPr>
+      <w:r>
+        <w:rPr>
+          <w:sz w:val="20"/>
+          <w:szCs w:val="20"/>
+        </w:rPr>
+        <w:t>teh world hardest game, el api de java y marketplace de eclipse</w:t>
+      </w:r>
+    </w:p>
+    <w:p>
+      <w:pPr>
+        <w:rPr>
+          <w:sz w:val="20"/>
+          <w:szCs w:val="20"/>
+        </w:rPr>
+      </w:pPr>
+    </w:p>
+    <w:p>
+      <w:pPr>
+        <w:rPr>
+          <w:sz w:val="20"/>
+          <w:szCs w:val="20"/>
+        </w:rPr>
+      </w:pPr>
+    </w:p>
+    <w:p>
+      <w:pPr>
+        <w:rPr>
+          <w:sz w:val="20"/>
+          <w:szCs w:val="20"/>
+        </w:rPr>
+      </w:pPr>
+      <w:r>
+        <w:rPr>
+          <w:sz w:val="20"/>
+          <w:szCs w:val="20"/>
+        </w:rPr>
+        <w:t>Enlace al repositorio de GitHub</w:t>
+      </w:r>
+    </w:p>
+    <w:p>
+      <w:pPr>
+        <w:rPr>
+          <w:sz w:val="20"/>
+          <w:szCs w:val="20"/>
+        </w:rPr>
+      </w:pPr>
+      <w:r>
+        <w:rPr>
+          <w:sz w:val="20"/>
+          <w:szCs w:val="20"/>
+        </w:rPr>
+        <w:t>https://github.com/paulisdiar/FinalProyect.git</w:t>
+      </w:r>
     </w:p>
     <w:sectPr>
       <w:pgSz w:w="11909" w:h="16834"/>

</xml_diff>